<commit_message>
Fix data leakage: split by trial, not by window
Windows are 410 samples with a 102 sample hop, so consecutive windows share 308 of their 410 samples. train_test_split shuffles all windows, which put near-identical copies of nearly every test window into the training set. The classifier was recognising stretches of signal it had already seen rather than recognising gestures.

Hand open vs hand close drops from 0.978 to 0.834 when whole trials are held out instead. Trials are  separate recordings ten seconds apart, so nothing is
shared across the split.

Now tracks which trial every window came from, which is what makes splitting on recordings possible at all.
</commit_message>
<xml_diff>
--- a/Project Notebook.docx
+++ b/Project Notebook.docx
@@ -7,6 +7,7 @@
         <w:rPr>
           <w:b/>
           <w:bCs/>
+          <w:color w:val="000000" w:themeColor="text1"/>
           <w:u w:val="single"/>
         </w:rPr>
       </w:pPr>
@@ -14,6 +15,7 @@
         <w:rPr>
           <w:b/>
           <w:bCs/>
+          <w:color w:val="000000" w:themeColor="text1"/>
           <w:u w:val="single"/>
         </w:rPr>
         <w:t>EMG Decoder</w:t>
@@ -24,145 +26,1659 @@
         <w:rPr>
           <w:b/>
           <w:bCs/>
+          <w:color w:val="000000" w:themeColor="text1"/>
           <w:u w:val="single"/>
         </w:rPr>
       </w:pPr>
     </w:p>
     <w:p>
-      <w:r>
+      <w:pPr>
+        <w:rPr>
+          <w:color w:val="000000" w:themeColor="text1"/>
+        </w:rPr>
+      </w:pPr>
+      <w:r>
+        <w:rPr>
+          <w:color w:val="000000" w:themeColor="text1"/>
+        </w:rPr>
         <w:t>Surface EM</w:t>
       </w:r>
       <w:r>
+        <w:rPr>
+          <w:color w:val="000000" w:themeColor="text1"/>
+        </w:rPr>
         <w:t xml:space="preserve">G </w:t>
       </w:r>
       <w:r>
+        <w:rPr>
+          <w:color w:val="000000" w:themeColor="text1"/>
+        </w:rPr>
         <w:t xml:space="preserve">is not a smooth waveform like an ECG. When a muscle contracts, hundreds of motor units fire asynchronously, and each firing sends an electrical wave down the muscle fibres. </w:t>
       </w:r>
       <w:r>
+        <w:rPr>
+          <w:color w:val="000000" w:themeColor="text1"/>
+        </w:rPr>
         <w:t>The</w:t>
       </w:r>
       <w:r>
+        <w:rPr>
+          <w:color w:val="000000" w:themeColor="text1"/>
+        </w:rPr>
         <w:t xml:space="preserve"> electrode sits on the skin above and picks up the superposition of all of them, which looks almost exactly like random noise. The information is not in the shape of the </w:t>
       </w:r>
       <w:r>
+        <w:rPr>
+          <w:color w:val="000000" w:themeColor="text1"/>
+        </w:rPr>
         <w:t>vibration;</w:t>
       </w:r>
       <w:r>
+        <w:rPr>
+          <w:color w:val="000000" w:themeColor="text1"/>
+        </w:rPr>
         <w:t xml:space="preserve"> it is in </w:t>
       </w:r>
       <w:r>
         <w:rPr>
           <w:rStyle w:val="Strong"/>
+          <w:color w:val="000000" w:themeColor="text1"/>
         </w:rPr>
         <w:t xml:space="preserve">how big the </w:t>
       </w:r>
       <w:r>
         <w:rPr>
           <w:rStyle w:val="Strong"/>
+          <w:color w:val="000000" w:themeColor="text1"/>
         </w:rPr>
         <w:t>vibration</w:t>
       </w:r>
       <w:r>
         <w:rPr>
           <w:rStyle w:val="Strong"/>
+          <w:color w:val="000000" w:themeColor="text1"/>
         </w:rPr>
         <w:t xml:space="preserve"> is, on which channels, and how fast it </w:t>
       </w:r>
       <w:r>
         <w:rPr>
           <w:rStyle w:val="Strong"/>
+          <w:color w:val="000000" w:themeColor="text1"/>
         </w:rPr>
         <w:t>vibrates</w:t>
       </w:r>
       <w:r>
+        <w:rPr>
+          <w:color w:val="000000" w:themeColor="text1"/>
+        </w:rPr>
         <w:t>.</w:t>
       </w:r>
     </w:p>
-    <w:p/>
-    <w:p>
-      <w:r>
+    <w:p>
+      <w:pPr>
+        <w:rPr>
+          <w:color w:val="000000" w:themeColor="text1"/>
+        </w:rPr>
+      </w:pPr>
+    </w:p>
+    <w:p>
+      <w:pPr>
+        <w:rPr>
+          <w:color w:val="000000" w:themeColor="text1"/>
+        </w:rPr>
+      </w:pPr>
+      <w:r>
+        <w:rPr>
+          <w:color w:val="000000" w:themeColor="text1"/>
+        </w:rPr>
         <w:t xml:space="preserve">Physionet.org is a website where hundreds of </w:t>
       </w:r>
       <w:r>
+        <w:rPr>
+          <w:color w:val="000000" w:themeColor="text1"/>
+        </w:rPr>
         <w:t>biomedical and clinical data</w:t>
       </w:r>
       <w:r>
+        <w:rPr>
+          <w:color w:val="000000" w:themeColor="text1"/>
+        </w:rPr>
         <w:t>sets are recorded for open-source use in machine-learning models. “</w:t>
       </w:r>
       <w:r>
+        <w:rPr>
+          <w:color w:val="000000" w:themeColor="text1"/>
+        </w:rPr>
         <w:t xml:space="preserve">PhysioNet has evolved from a repository </w:t>
       </w:r>
       <w:proofErr w:type="spellStart"/>
       <w:r>
+        <w:rPr>
+          <w:color w:val="000000" w:themeColor="text1"/>
+        </w:rPr>
         <w:t>centered</w:t>
       </w:r>
       <w:proofErr w:type="spellEnd"/>
       <w:r>
+        <w:rPr>
+          <w:color w:val="000000" w:themeColor="text1"/>
+        </w:rPr>
         <w:t xml:space="preserve"> on physiological waveforms into an integrated, community-driven framework for publishing, accessing, and reusing biomedical data and software. Its mission remains to make biomedical and clinical datasets freely available to the life-science research community, and to promote, enable, and </w:t>
       </w:r>
       <w:proofErr w:type="spellStart"/>
       <w:r>
+        <w:rPr>
+          <w:color w:val="000000" w:themeColor="text1"/>
+        </w:rPr>
         <w:t>catalyze</w:t>
       </w:r>
       <w:proofErr w:type="spellEnd"/>
       <w:r>
+        <w:rPr>
+          <w:color w:val="000000" w:themeColor="text1"/>
+        </w:rPr>
         <w:t xml:space="preserve"> reproducible, data-driven research with tangible clinical impact.</w:t>
       </w:r>
       <w:r>
+        <w:rPr>
+          <w:color w:val="000000" w:themeColor="text1"/>
+        </w:rPr>
         <w:t xml:space="preserve">” [1] </w:t>
       </w:r>
     </w:p>
-    <w:p/>
-    <w:p>
-      <w:r>
+    <w:p>
+      <w:pPr>
+        <w:rPr>
+          <w:color w:val="000000" w:themeColor="text1"/>
+        </w:rPr>
+      </w:pPr>
+    </w:p>
+    <w:p>
+      <w:pPr>
+        <w:rPr>
+          <w:color w:val="000000" w:themeColor="text1"/>
+        </w:rPr>
+      </w:pPr>
+      <w:r>
+        <w:rPr>
+          <w:color w:val="000000" w:themeColor="text1"/>
+        </w:rPr>
         <w:t xml:space="preserve">The dataset that I will be using for this project is the “Gesture Recognition and Biometrics </w:t>
       </w:r>
       <w:proofErr w:type="spellStart"/>
       <w:r>
+        <w:rPr>
+          <w:color w:val="000000" w:themeColor="text1"/>
+        </w:rPr>
         <w:t>ElectroMyogram</w:t>
       </w:r>
       <w:proofErr w:type="spellEnd"/>
       <w:r>
+        <w:rPr>
+          <w:color w:val="000000" w:themeColor="text1"/>
+        </w:rPr>
         <w:t xml:space="preserve"> (</w:t>
       </w:r>
       <w:proofErr w:type="spellStart"/>
       <w:r>
+        <w:rPr>
+          <w:color w:val="000000" w:themeColor="text1"/>
+        </w:rPr>
         <w:t>GRABMyo</w:t>
       </w:r>
       <w:proofErr w:type="spellEnd"/>
       <w:r>
+        <w:rPr>
+          <w:color w:val="000000" w:themeColor="text1"/>
+        </w:rPr>
         <w:t>)” This is an open-access dataset of electromyogram (EMG) recorded from the wrist and forearm muscles of 43 people while they performed various hand gestures.</w:t>
       </w:r>
     </w:p>
-    <w:p/>
-    <w:p>
-      <w:r>
+    <w:p>
+      <w:pPr>
+        <w:rPr>
+          <w:color w:val="000000" w:themeColor="text1"/>
+        </w:rPr>
+      </w:pPr>
+    </w:p>
+    <w:p>
+      <w:pPr>
+        <w:rPr>
+          <w:color w:val="000000" w:themeColor="text1"/>
+        </w:rPr>
+      </w:pPr>
+      <w:r>
+        <w:rPr>
+          <w:color w:val="000000" w:themeColor="text1"/>
+        </w:rPr>
         <w:t>Electromyography (EMG) refers to the electrical signals from muscles’ motor units produced during contraction and controlled by the central nervous system (CNS). There are two types: surface EMG, recorded by non-invasive, skin-surface electrodes and intramuscular EMG, recorded by invasive electrodes via needles/wires. [2]</w:t>
       </w:r>
       <w:r>
+        <w:rPr>
+          <w:color w:val="000000" w:themeColor="text1"/>
+        </w:rPr>
         <w:t>.</w:t>
       </w:r>
     </w:p>
-    <w:p/>
-    <w:p>
-      <w:r>
+    <w:p>
+      <w:pPr>
+        <w:rPr>
+          <w:color w:val="000000" w:themeColor="text1"/>
+        </w:rPr>
+      </w:pPr>
+    </w:p>
+    <w:p>
+      <w:pPr>
+        <w:rPr>
+          <w:color w:val="000000" w:themeColor="text1"/>
+        </w:rPr>
+      </w:pPr>
+      <w:r>
+        <w:rPr>
+          <w:color w:val="000000" w:themeColor="text1"/>
+        </w:rPr>
         <w:t>The aim of this project is to eventually apply EMG signals to control commands for robotic or prosthetic applications.</w:t>
       </w:r>
       <w:r>
+        <w:rPr>
+          <w:color w:val="000000" w:themeColor="text1"/>
+        </w:rPr>
         <w:br w:type="page"/>
       </w:r>
     </w:p>
     <w:p>
       <w:pPr>
+        <w:rPr>
+          <w:color w:val="000000" w:themeColor="text1"/>
+        </w:rPr>
+      </w:pPr>
+    </w:p>
+    <w:p>
+      <w:pPr>
+        <w:rPr>
+          <w:color w:val="000000" w:themeColor="text1"/>
+        </w:rPr>
+      </w:pPr>
+    </w:p>
+    <w:p>
+      <w:pPr>
+        <w:rPr>
+          <w:color w:val="000000" w:themeColor="text1"/>
+        </w:rPr>
+      </w:pPr>
+      <w:r>
+        <w:rPr>
+          <w:color w:val="000000" w:themeColor="text1"/>
+        </w:rPr>
+        <w:t xml:space="preserve">2026-09-09 — Session 1: setup and first look at the data </w:t>
+      </w:r>
+    </w:p>
+    <w:p>
+      <w:pPr>
+        <w:rPr>
+          <w:color w:val="000000" w:themeColor="text1"/>
+        </w:rPr>
+      </w:pPr>
+    </w:p>
+    <w:p>
+      <w:pPr>
+        <w:rPr>
+          <w:color w:val="000000" w:themeColor="text1"/>
+        </w:rPr>
+      </w:pPr>
+      <w:r>
+        <w:rPr>
+          <w:color w:val="000000" w:themeColor="text1"/>
+        </w:rPr>
+        <w:t xml:space="preserve">Made the repo, set up Python, and downloaded one participant from the </w:t>
+      </w:r>
+      <w:proofErr w:type="spellStart"/>
+      <w:r>
+        <w:rPr>
+          <w:color w:val="000000" w:themeColor="text1"/>
+        </w:rPr>
+        <w:t>GRABMyo</w:t>
+      </w:r>
+      <w:proofErr w:type="spellEnd"/>
+      <w:r>
+        <w:rPr>
+          <w:color w:val="000000" w:themeColor="text1"/>
+        </w:rPr>
+        <w:t xml:space="preserve"> dataset. Then plotted one electrode during rest, hand open and hand close. </w:t>
+      </w:r>
+    </w:p>
+    <w:p>
+      <w:pPr>
+        <w:rPr>
+          <w:color w:val="000000" w:themeColor="text1"/>
+        </w:rPr>
+      </w:pPr>
+    </w:p>
+    <w:p>
+      <w:pPr>
+        <w:rPr>
+          <w:color w:val="000000" w:themeColor="text1"/>
+        </w:rPr>
+      </w:pPr>
+      <w:r>
+        <w:rPr>
+          <w:color w:val="000000" w:themeColor="text1"/>
+        </w:rPr>
+        <w:t xml:space="preserve">EMG does not look like a clean wave. It looks like noise. That is because hundreds of small muscle fibres fire at random times and the electrode picks up all of them </w:t>
+      </w:r>
+      <w:proofErr w:type="gramStart"/>
+      <w:r>
+        <w:rPr>
+          <w:color w:val="000000" w:themeColor="text1"/>
+        </w:rPr>
+        <w:t>mixed together</w:t>
+      </w:r>
+      <w:proofErr w:type="gramEnd"/>
+      <w:r>
+        <w:rPr>
+          <w:color w:val="000000" w:themeColor="text1"/>
+        </w:rPr>
+        <w:t xml:space="preserve">. The useful information is how big the noise is, not what shape it is. </w:t>
+      </w:r>
+    </w:p>
+    <w:p>
+      <w:pPr>
+        <w:rPr>
+          <w:color w:val="000000" w:themeColor="text1"/>
+        </w:rPr>
+      </w:pPr>
+    </w:p>
+    <w:p>
+      <w:pPr>
+        <w:rPr>
+          <w:color w:val="000000" w:themeColor="text1"/>
+        </w:rPr>
+      </w:pPr>
+      <w:r>
+        <w:rPr>
+          <w:color w:val="000000" w:themeColor="text1"/>
+        </w:rPr>
+        <w:t xml:space="preserve">Rest was a thin band. Both active gestures were much fatter. </w:t>
+      </w:r>
+      <w:proofErr w:type="gramStart"/>
+      <w:r>
+        <w:rPr>
+          <w:color w:val="000000" w:themeColor="text1"/>
+        </w:rPr>
+        <w:t>So</w:t>
+      </w:r>
+      <w:proofErr w:type="gramEnd"/>
+      <w:r>
+        <w:rPr>
+          <w:color w:val="000000" w:themeColor="text1"/>
+        </w:rPr>
+        <w:t xml:space="preserve"> spotting that the hand is doing something is easy. Telling hand open apart from hand close is not, at least not from one electrode. </w:t>
+      </w:r>
+    </w:p>
+    <w:p>
+      <w:pPr>
+        <w:rPr>
+          <w:color w:val="000000" w:themeColor="text1"/>
+        </w:rPr>
+      </w:pPr>
+    </w:p>
+    <w:p>
+      <w:pPr>
+        <w:rPr>
+          <w:color w:val="000000" w:themeColor="text1"/>
+        </w:rPr>
+      </w:pPr>
+      <w:r>
+        <w:rPr>
+          <w:color w:val="000000" w:themeColor="text1"/>
+        </w:rPr>
+        <w:t xml:space="preserve">Two things broke before anything worked: </w:t>
+      </w:r>
+    </w:p>
+    <w:p>
+      <w:pPr>
+        <w:pStyle w:val="ListParagraph"/>
+        <w:numPr>
+          <w:ilvl w:val="0"/>
+          <w:numId w:val="1"/>
+        </w:numPr>
+        <w:rPr>
+          <w:color w:val="000000" w:themeColor="text1"/>
+        </w:rPr>
+      </w:pPr>
+      <w:r>
+        <w:rPr>
+          <w:color w:val="000000" w:themeColor="text1"/>
+        </w:rPr>
+        <w:t xml:space="preserve">Every download failed with CERTIFICATE_VERIFY_FAILED. Python installed from python.org on Mac does not use the system list of trusted websites, so it trusted nothing. Fixed by pointing it at the </w:t>
+      </w:r>
+      <w:proofErr w:type="spellStart"/>
+      <w:r>
+        <w:rPr>
+          <w:color w:val="000000" w:themeColor="text1"/>
+        </w:rPr>
+        <w:t>certifi</w:t>
+      </w:r>
+      <w:proofErr w:type="spellEnd"/>
+      <w:r>
+        <w:rPr>
+          <w:color w:val="000000" w:themeColor="text1"/>
+        </w:rPr>
+        <w:t xml:space="preserve"> package's list instead. </w:t>
+      </w:r>
+    </w:p>
+    <w:p>
+      <w:pPr>
+        <w:pStyle w:val="ListParagraph"/>
+        <w:numPr>
+          <w:ilvl w:val="0"/>
+          <w:numId w:val="1"/>
+        </w:numPr>
+        <w:rPr>
+          <w:color w:val="000000" w:themeColor="text1"/>
+        </w:rPr>
+      </w:pPr>
+      <w:r>
+        <w:rPr>
+          <w:color w:val="000000" w:themeColor="text1"/>
+        </w:rPr>
+        <w:t>Then every download gave a 404. The PhysioNet website says the folders are</w:t>
+      </w:r>
+      <w:r>
+        <w:rPr>
+          <w:color w:val="000000" w:themeColor="text1"/>
+        </w:rPr>
+        <w:t xml:space="preserve"> </w:t>
+      </w:r>
+      <w:r>
+        <w:rPr>
+          <w:color w:val="000000" w:themeColor="text1"/>
+        </w:rPr>
+        <w:t>named session1_subject1.</w:t>
+      </w:r>
+    </w:p>
+    <w:p>
+      <w:pPr>
+        <w:pStyle w:val="ListParagraph"/>
+        <w:ind w:left="1080"/>
+        <w:rPr>
+          <w:color w:val="000000" w:themeColor="text1"/>
+        </w:rPr>
+      </w:pPr>
+    </w:p>
+    <w:p>
+      <w:pPr>
+        <w:rPr>
+          <w:color w:val="000000" w:themeColor="text1"/>
+        </w:rPr>
+      </w:pPr>
+      <w:r>
+        <w:rPr>
+          <w:color w:val="000000" w:themeColor="text1"/>
+        </w:rPr>
+        <w:t xml:space="preserve">On disk they are </w:t>
+      </w:r>
+      <w:proofErr w:type="gramStart"/>
+      <w:r>
+        <w:rPr>
+          <w:color w:val="000000" w:themeColor="text1"/>
+        </w:rPr>
+        <w:t>actually session1_participant1</w:t>
+      </w:r>
+      <w:proofErr w:type="gramEnd"/>
+      <w:r>
+        <w:rPr>
+          <w:color w:val="000000" w:themeColor="text1"/>
+        </w:rPr>
+        <w:t xml:space="preserve">. </w:t>
+      </w:r>
+    </w:p>
+    <w:p>
+      <w:pPr>
+        <w:rPr>
+          <w:color w:val="000000" w:themeColor="text1"/>
+        </w:rPr>
+      </w:pPr>
+    </w:p>
+    <w:p>
+      <w:pPr>
+        <w:rPr>
+          <w:color w:val="000000" w:themeColor="text1"/>
+        </w:rPr>
+      </w:pPr>
+      <w:r>
+        <w:rPr>
+          <w:color w:val="000000" w:themeColor="text1"/>
+        </w:rPr>
+        <w:t xml:space="preserve">Lesson: when the docs and the files disagree, the files are right. </w:t>
+      </w:r>
+    </w:p>
+    <w:p>
+      <w:pPr>
+        <w:rPr>
+          <w:color w:val="000000" w:themeColor="text1"/>
+        </w:rPr>
+      </w:pPr>
+      <w:r>
         <w:rPr>
           <w:b/>
           <w:bCs/>
+          <w:color w:val="000000" w:themeColor="text1"/>
+          <w:u w:val="single"/>
+        </w:rPr>
+        <w:drawing>
+          <wp:anchor distT="0" distB="0" distL="114300" distR="114300" simplePos="0" relativeHeight="251663360" behindDoc="0" locked="0" layoutInCell="1" allowOverlap="1" wp14:anchorId="55C5254B" wp14:editId="394E508B">
+            <wp:simplePos x="0" y="0"/>
+            <wp:positionH relativeFrom="column">
+              <wp:posOffset>0</wp:posOffset>
+            </wp:positionH>
+            <wp:positionV relativeFrom="paragraph">
+              <wp:posOffset>261118</wp:posOffset>
+            </wp:positionV>
+            <wp:extent cx="5731510" cy="2983865"/>
+            <wp:effectExtent l="0" t="0" r="0" b="635"/>
+            <wp:wrapSquare wrapText="bothSides"/>
+            <wp:docPr id="1940977908" name="Picture 1"/>
+            <wp:cNvGraphicFramePr>
+              <a:graphicFrameLocks xmlns:a="http://schemas.openxmlformats.org/drawingml/2006/main" noChangeAspect="1"/>
+            </wp:cNvGraphicFramePr>
+            <a:graphic xmlns:a="http://schemas.openxmlformats.org/drawingml/2006/main">
+              <a:graphicData uri="http://schemas.openxmlformats.org/drawingml/2006/picture">
+                <pic:pic xmlns:pic="http://schemas.openxmlformats.org/drawingml/2006/picture">
+                  <pic:nvPicPr>
+                    <pic:cNvPr id="1940977908" name=""/>
+                    <pic:cNvPicPr/>
+                  </pic:nvPicPr>
+                  <pic:blipFill>
+                    <a:blip r:embed="rId8"/>
+                    <a:stretch>
+                      <a:fillRect/>
+                    </a:stretch>
+                  </pic:blipFill>
+                  <pic:spPr>
+                    <a:xfrm>
+                      <a:off x="0" y="0"/>
+                      <a:ext cx="5731510" cy="2983865"/>
+                    </a:xfrm>
+                    <a:prstGeom prst="rect">
+                      <a:avLst/>
+                    </a:prstGeom>
+                  </pic:spPr>
+                </pic:pic>
+              </a:graphicData>
+            </a:graphic>
+          </wp:anchor>
+        </w:drawing>
+      </w:r>
+    </w:p>
+    <w:p>
+      <w:pPr>
+        <w:rPr>
+          <w:color w:val="000000" w:themeColor="text1"/>
+        </w:rPr>
+      </w:pPr>
+      <w:r>
+        <w:rPr>
+          <w:noProof/>
+          <w:color w:val="000000" w:themeColor="text1"/>
+        </w:rPr>
+        <w:lastRenderedPageBreak/>
+        <w:drawing>
+          <wp:anchor distT="0" distB="0" distL="114300" distR="114300" simplePos="0" relativeHeight="251664384" behindDoc="0" locked="0" layoutInCell="1" allowOverlap="1" wp14:anchorId="00AF7A52" wp14:editId="5C4E84FF">
+            <wp:simplePos x="0" y="0"/>
+            <wp:positionH relativeFrom="column">
+              <wp:posOffset>6985</wp:posOffset>
+            </wp:positionH>
+            <wp:positionV relativeFrom="paragraph">
+              <wp:posOffset>-26</wp:posOffset>
+            </wp:positionV>
+            <wp:extent cx="5731510" cy="4000500"/>
+            <wp:effectExtent l="0" t="0" r="0" b="0"/>
+            <wp:wrapSquare wrapText="bothSides"/>
+            <wp:docPr id="654655837" name="Picture 1"/>
+            <wp:cNvGraphicFramePr>
+              <a:graphicFrameLocks xmlns:a="http://schemas.openxmlformats.org/drawingml/2006/main" noChangeAspect="1"/>
+            </wp:cNvGraphicFramePr>
+            <a:graphic xmlns:a="http://schemas.openxmlformats.org/drawingml/2006/main">
+              <a:graphicData uri="http://schemas.openxmlformats.org/drawingml/2006/picture">
+                <pic:pic xmlns:pic="http://schemas.openxmlformats.org/drawingml/2006/picture">
+                  <pic:nvPicPr>
+                    <pic:cNvPr id="654655837" name="Picture 654655837"/>
+                    <pic:cNvPicPr/>
+                  </pic:nvPicPr>
+                  <pic:blipFill>
+                    <a:blip r:embed="rId9" cstate="print">
+                      <a:extLst>
+                        <a:ext uri="{28A0092B-C50C-407E-A947-70E740481C1C}">
+                          <a14:useLocalDpi xmlns:a14="http://schemas.microsoft.com/office/drawing/2010/main" val="0"/>
+                        </a:ext>
+                      </a:extLst>
+                    </a:blip>
+                    <a:stretch>
+                      <a:fillRect/>
+                    </a:stretch>
+                  </pic:blipFill>
+                  <pic:spPr>
+                    <a:xfrm>
+                      <a:off x="0" y="0"/>
+                      <a:ext cx="5731510" cy="4000500"/>
+                    </a:xfrm>
+                    <a:prstGeom prst="rect">
+                      <a:avLst/>
+                    </a:prstGeom>
+                  </pic:spPr>
+                </pic:pic>
+              </a:graphicData>
+            </a:graphic>
+          </wp:anchor>
+        </w:drawing>
+      </w:r>
+    </w:p>
+    <w:p>
+      <w:pPr>
+        <w:rPr>
+          <w:color w:val="000000" w:themeColor="text1"/>
+        </w:rPr>
+      </w:pPr>
+    </w:p>
+    <w:p>
+      <w:pPr>
+        <w:rPr>
+          <w:color w:val="000000" w:themeColor="text1"/>
+        </w:rPr>
+      </w:pPr>
+    </w:p>
+    <w:p>
+      <w:pPr>
+        <w:rPr>
+          <w:color w:val="000000" w:themeColor="text1"/>
+        </w:rPr>
+      </w:pPr>
+    </w:p>
+    <w:p>
+      <w:pPr>
+        <w:rPr>
+          <w:color w:val="000000" w:themeColor="text1"/>
+        </w:rPr>
+      </w:pPr>
+      <w:r>
+        <w:rPr>
+          <w:color w:val="000000" w:themeColor="text1"/>
+        </w:rPr>
+        <w:t xml:space="preserve">2026-09-09 — Session 2: a loader I can reuse </w:t>
+      </w:r>
+    </w:p>
+    <w:p>
+      <w:pPr>
+        <w:rPr>
+          <w:color w:val="000000" w:themeColor="text1"/>
+        </w:rPr>
+      </w:pPr>
+    </w:p>
+    <w:p>
+      <w:pPr>
+        <w:rPr>
+          <w:color w:val="000000" w:themeColor="text1"/>
+        </w:rPr>
+      </w:pPr>
+    </w:p>
+    <w:p>
+      <w:pPr>
+        <w:rPr>
+          <w:color w:val="000000" w:themeColor="text1"/>
+        </w:rPr>
+      </w:pPr>
+      <w:r>
+        <w:rPr>
+          <w:color w:val="000000" w:themeColor="text1"/>
+        </w:rPr>
+        <w:t xml:space="preserve">Moved the file path out of the plotting script and into load.py. That file is now the only place that knows where the data lives and how to read it. </w:t>
+      </w:r>
+    </w:p>
+    <w:p>
+      <w:pPr>
+        <w:rPr>
+          <w:color w:val="000000" w:themeColor="text1"/>
+        </w:rPr>
+      </w:pPr>
+    </w:p>
+    <w:p>
+      <w:pPr>
+        <w:rPr>
+          <w:color w:val="000000" w:themeColor="text1"/>
+        </w:rPr>
+      </w:pPr>
+      <w:r>
+        <w:rPr>
+          <w:color w:val="000000" w:themeColor="text1"/>
+        </w:rPr>
+        <w:t xml:space="preserve">Rule I am </w:t>
+      </w:r>
+      <w:proofErr w:type="gramStart"/>
+      <w:r>
+        <w:rPr>
+          <w:color w:val="000000" w:themeColor="text1"/>
+        </w:rPr>
+        <w:t>setting:</w:t>
+      </w:r>
+      <w:proofErr w:type="gramEnd"/>
+      <w:r>
+        <w:rPr>
+          <w:color w:val="000000" w:themeColor="text1"/>
+        </w:rPr>
+        <w:t xml:space="preserve"> nothing else in the project imports </w:t>
+      </w:r>
+      <w:proofErr w:type="spellStart"/>
+      <w:r>
+        <w:rPr>
+          <w:color w:val="000000" w:themeColor="text1"/>
+        </w:rPr>
+        <w:t>wfdb</w:t>
+      </w:r>
+      <w:proofErr w:type="spellEnd"/>
+      <w:r>
+        <w:rPr>
+          <w:color w:val="000000" w:themeColor="text1"/>
+        </w:rPr>
+        <w:t xml:space="preserve">. If I later change how the data is stored, or read from a real armband instead of files, only load.py </w:t>
+      </w:r>
+      <w:proofErr w:type="gramStart"/>
+      <w:r>
+        <w:rPr>
+          <w:color w:val="000000" w:themeColor="text1"/>
+        </w:rPr>
+        <w:t>has to</w:t>
+      </w:r>
+      <w:proofErr w:type="gramEnd"/>
+      <w:r>
+        <w:rPr>
+          <w:color w:val="000000" w:themeColor="text1"/>
+        </w:rPr>
+        <w:t xml:space="preserve"> change. </w:t>
+      </w:r>
+    </w:p>
+    <w:p>
+      <w:pPr>
+        <w:rPr>
+          <w:color w:val="000000" w:themeColor="text1"/>
+        </w:rPr>
+      </w:pPr>
+    </w:p>
+    <w:p>
+      <w:pPr>
+        <w:rPr>
+          <w:color w:val="000000" w:themeColor="text1"/>
+        </w:rPr>
+      </w:pPr>
+      <w:r>
+        <w:rPr>
+          <w:color w:val="000000" w:themeColor="text1"/>
+        </w:rPr>
+        <w:t xml:space="preserve">Then wrote summarise.py, which loads all 119 trials for participant 1 and prints how loud each gesture is. </w:t>
+      </w:r>
+    </w:p>
+    <w:p>
+      <w:pPr>
+        <w:rPr>
+          <w:color w:val="000000" w:themeColor="text1"/>
+        </w:rPr>
+      </w:pPr>
+    </w:p>
+    <w:p>
+      <w:pPr>
+        <w:rPr>
+          <w:color w:val="000000" w:themeColor="text1"/>
+        </w:rPr>
+      </w:pPr>
+      <w:r>
+        <w:rPr>
+          <w:color w:val="000000" w:themeColor="text1"/>
+        </w:rPr>
+        <w:t xml:space="preserve">Numbers from session 1, measured on electrode F1: </w:t>
+      </w:r>
+    </w:p>
+    <w:p>
+      <w:pPr>
+        <w:pStyle w:val="ListParagraph"/>
+        <w:numPr>
+          <w:ilvl w:val="0"/>
+          <w:numId w:val="2"/>
+        </w:numPr>
+        <w:rPr>
+          <w:color w:val="000000" w:themeColor="text1"/>
+        </w:rPr>
+      </w:pPr>
+      <w:r>
+        <w:rPr>
+          <w:color w:val="000000" w:themeColor="text1"/>
+        </w:rPr>
+        <w:t>rest: 0.01368 mV</w:t>
+      </w:r>
+    </w:p>
+    <w:p>
+      <w:pPr>
+        <w:pStyle w:val="ListParagraph"/>
+        <w:numPr>
+          <w:ilvl w:val="0"/>
+          <w:numId w:val="2"/>
+        </w:numPr>
+        <w:rPr>
+          <w:color w:val="000000" w:themeColor="text1"/>
+        </w:rPr>
+      </w:pPr>
+      <w:r>
+        <w:rPr>
+          <w:color w:val="000000" w:themeColor="text1"/>
+        </w:rPr>
+        <w:t>hand open: 0.03676 mV</w:t>
+      </w:r>
+    </w:p>
+    <w:p>
+      <w:pPr>
+        <w:pStyle w:val="ListParagraph"/>
+        <w:numPr>
+          <w:ilvl w:val="0"/>
+          <w:numId w:val="2"/>
+        </w:numPr>
+        <w:rPr>
+          <w:color w:val="000000" w:themeColor="text1"/>
+        </w:rPr>
+      </w:pPr>
+      <w:r>
+        <w:rPr>
+          <w:color w:val="000000" w:themeColor="text1"/>
+        </w:rPr>
+        <w:t xml:space="preserve">hand close: 0.04391 mV </w:t>
+      </w:r>
+    </w:p>
+    <w:p>
+      <w:pPr>
+        <w:pStyle w:val="ListParagraph"/>
+        <w:rPr>
+          <w:color w:val="000000" w:themeColor="text1"/>
+        </w:rPr>
+      </w:pPr>
+    </w:p>
+    <w:p>
+      <w:pPr>
+        <w:rPr>
+          <w:color w:val="000000" w:themeColor="text1"/>
+        </w:rPr>
+      </w:pPr>
+      <w:r>
+        <w:rPr>
+          <w:color w:val="000000" w:themeColor="text1"/>
+        </w:rPr>
+        <w:t xml:space="preserve">Active gestures are about 3 times louder than rest. But hand close is only about 1.2 times hand open. A 20 percent difference is nothing, because how hard I squeeze changes the size by more than that. </w:t>
+      </w:r>
+    </w:p>
+    <w:p>
+      <w:pPr>
+        <w:rPr>
+          <w:color w:val="000000" w:themeColor="text1"/>
+        </w:rPr>
+      </w:pPr>
+    </w:p>
+    <w:p>
+      <w:pPr>
+        <w:rPr>
+          <w:color w:val="000000" w:themeColor="text1"/>
+        </w:rPr>
+      </w:pPr>
+      <w:proofErr w:type="gramStart"/>
+      <w:r>
+        <w:rPr>
+          <w:color w:val="000000" w:themeColor="text1"/>
+        </w:rPr>
+        <w:lastRenderedPageBreak/>
+        <w:t>So</w:t>
+      </w:r>
+      <w:proofErr w:type="gramEnd"/>
+      <w:r>
+        <w:rPr>
+          <w:color w:val="000000" w:themeColor="text1"/>
+        </w:rPr>
+        <w:t xml:space="preserve"> loudness alone cannot tell 17 gestures apart. What can tell them apart is which electrodes are loud. The muscles that close your hand sit underneath your forearm. The ones that open it sit on top. Different gestures light up different electrodes. </w:t>
+      </w:r>
+    </w:p>
+    <w:p>
+      <w:pPr>
+        <w:rPr>
+          <w:color w:val="000000" w:themeColor="text1"/>
+        </w:rPr>
+      </w:pPr>
+    </w:p>
+    <w:p>
+      <w:pPr>
+        <w:rPr>
+          <w:b/>
+          <w:bCs/>
+          <w:color w:val="000000" w:themeColor="text1"/>
+          <w:u w:val="single"/>
+        </w:rPr>
+      </w:pPr>
+      <w:r>
+        <w:rPr>
+          <w:color w:val="000000" w:themeColor="text1"/>
+        </w:rPr>
+        <w:t>That means the thing to feed a classifier is the pattern across all 16 electrodes, not the size of any single one. That is what I am building towards.</w:t>
+      </w:r>
+      <w:r>
+        <w:rPr>
+          <w:b/>
+          <w:bCs/>
+          <w:color w:val="000000" w:themeColor="text1"/>
+          <w:u w:val="single"/>
+        </w:rPr>
+        <w:t xml:space="preserve"> </w:t>
+      </w:r>
+    </w:p>
+    <w:p>
+      <w:pPr>
+        <w:rPr>
+          <w:b/>
+          <w:bCs/>
+          <w:color w:val="000000" w:themeColor="text1"/>
+          <w:u w:val="single"/>
+        </w:rPr>
+      </w:pPr>
+    </w:p>
+    <w:p>
+      <w:pPr>
+        <w:rPr>
+          <w:b/>
+          <w:bCs/>
+          <w:color w:val="000000" w:themeColor="text1"/>
+          <w:u w:val="single"/>
+        </w:rPr>
+      </w:pPr>
+      <w:r>
+        <w:rPr>
+          <w:b/>
+          <w:bCs/>
+          <w:color w:val="000000" w:themeColor="text1"/>
+          <w:u w:val="single"/>
+        </w:rPr>
+        <w:drawing>
+          <wp:anchor distT="0" distB="0" distL="114300" distR="114300" simplePos="0" relativeHeight="251661312" behindDoc="0" locked="0" layoutInCell="1" allowOverlap="1" wp14:anchorId="78768B74" wp14:editId="76D0DF64">
+            <wp:simplePos x="0" y="0"/>
+            <wp:positionH relativeFrom="column">
+              <wp:posOffset>0</wp:posOffset>
+            </wp:positionH>
+            <wp:positionV relativeFrom="paragraph">
+              <wp:posOffset>-635</wp:posOffset>
+            </wp:positionV>
+            <wp:extent cx="5731510" cy="3043555"/>
+            <wp:effectExtent l="0" t="0" r="0" b="4445"/>
+            <wp:wrapNone/>
+            <wp:docPr id="999215376" name="Picture 1"/>
+            <wp:cNvGraphicFramePr>
+              <a:graphicFrameLocks xmlns:a="http://schemas.openxmlformats.org/drawingml/2006/main" noChangeAspect="1"/>
+            </wp:cNvGraphicFramePr>
+            <a:graphic xmlns:a="http://schemas.openxmlformats.org/drawingml/2006/main">
+              <a:graphicData uri="http://schemas.openxmlformats.org/drawingml/2006/picture">
+                <pic:pic xmlns:pic="http://schemas.openxmlformats.org/drawingml/2006/picture">
+                  <pic:nvPicPr>
+                    <pic:cNvPr id="999215376" name=""/>
+                    <pic:cNvPicPr/>
+                  </pic:nvPicPr>
+                  <pic:blipFill>
+                    <a:blip r:embed="rId10"/>
+                    <a:stretch>
+                      <a:fillRect/>
+                    </a:stretch>
+                  </pic:blipFill>
+                  <pic:spPr>
+                    <a:xfrm>
+                      <a:off x="0" y="0"/>
+                      <a:ext cx="5731510" cy="3043555"/>
+                    </a:xfrm>
+                    <a:prstGeom prst="rect">
+                      <a:avLst/>
+                    </a:prstGeom>
+                  </pic:spPr>
+                </pic:pic>
+              </a:graphicData>
+            </a:graphic>
+          </wp:anchor>
+        </w:drawing>
+      </w:r>
+      <w:r>
+        <w:rPr>
+          <w:b/>
+          <w:bCs/>
+          <w:color w:val="000000" w:themeColor="text1"/>
+          <w:u w:val="single"/>
+        </w:rPr>
+        <w:br w:type="page"/>
+      </w:r>
+    </w:p>
+    <w:p>
+      <w:pPr>
+        <w:rPr>
+          <w:color w:val="000000" w:themeColor="text1"/>
+        </w:rPr>
+      </w:pPr>
+      <w:r>
+        <w:rPr>
+          <w:color w:val="000000" w:themeColor="text1"/>
+        </w:rPr>
+        <w:lastRenderedPageBreak/>
+        <w:t>2026-09-09 – Session 3: Filtering and cutting into windows</w:t>
+      </w:r>
+    </w:p>
+    <w:p>
+      <w:pPr>
+        <w:rPr>
+          <w:color w:val="000000" w:themeColor="text1"/>
+        </w:rPr>
+      </w:pPr>
+    </w:p>
+    <w:p>
+      <w:pPr>
+        <w:rPr>
+          <w:b/>
+          <w:bCs/>
+          <w:color w:val="000000" w:themeColor="text1"/>
+        </w:rPr>
+      </w:pPr>
+      <w:r>
+        <w:rPr>
+          <w:b/>
+          <w:bCs/>
+          <w:color w:val="000000" w:themeColor="text1"/>
+        </w:rPr>
+        <w:t>Filters:</w:t>
+      </w:r>
+    </w:p>
+    <w:p>
+      <w:pPr>
+        <w:rPr>
+          <w:color w:val="000000" w:themeColor="text1"/>
+        </w:rPr>
+      </w:pPr>
+      <w:r>
+        <w:rPr>
+          <w:color w:val="000000" w:themeColor="text1"/>
+        </w:rPr>
+        <w:t xml:space="preserve">The signal is currently a mixture of vibrations at different speeds happening at once, resulting in the superposition of multiple sources of </w:t>
+      </w:r>
+      <w:r>
+        <w:rPr>
+          <w:color w:val="000000" w:themeColor="text1"/>
+        </w:rPr>
+        <w:t>signal. A filter will allow me to reduce the high and low frequencies.</w:t>
+      </w:r>
+    </w:p>
+    <w:p>
+      <w:pPr>
+        <w:rPr>
+          <w:color w:val="000000" w:themeColor="text1"/>
+        </w:rPr>
+      </w:pPr>
+    </w:p>
+    <w:p>
+      <w:pPr>
+        <w:rPr>
+          <w:color w:val="000000" w:themeColor="text1"/>
+        </w:rPr>
+      </w:pPr>
+      <w:r>
+        <w:rPr>
+          <w:color w:val="000000" w:themeColor="text1"/>
+        </w:rPr>
+        <w:t>Frequencies should be kept between 20 and 450Hz – anything below 20Hz is not a result of muscle and above 450Hz is likely electrical noise from instruments/equipment.</w:t>
+      </w:r>
+    </w:p>
+    <w:p>
+      <w:pPr>
+        <w:rPr>
+          <w:color w:val="000000" w:themeColor="text1"/>
+        </w:rPr>
+      </w:pPr>
+    </w:p>
+    <w:p>
+      <w:pPr>
+        <w:rPr>
+          <w:color w:val="000000" w:themeColor="text1"/>
+        </w:rPr>
+      </w:pPr>
+      <w:r>
+        <w:rPr>
+          <w:color w:val="000000" w:themeColor="text1"/>
+        </w:rPr>
+        <w:t xml:space="preserve">Most useable muscle energy lies between 50 and 150Hz [3] – This means that we will need to create a </w:t>
+      </w:r>
+      <w:r>
+        <w:rPr>
+          <w:b/>
+          <w:bCs/>
+          <w:color w:val="000000" w:themeColor="text1"/>
+        </w:rPr>
+        <w:t>bandpass filter</w:t>
+      </w:r>
+    </w:p>
+    <w:p>
+      <w:pPr>
+        <w:rPr>
+          <w:color w:val="000000" w:themeColor="text1"/>
+        </w:rPr>
+      </w:pPr>
+    </w:p>
+    <w:p>
+      <w:pPr>
+        <w:rPr>
+          <w:color w:val="000000" w:themeColor="text1"/>
+        </w:rPr>
+      </w:pPr>
+      <w:r>
+        <w:rPr>
+          <w:color w:val="000000" w:themeColor="text1"/>
+        </w:rPr>
+        <w:t>However, this dataset was already filtered between 10 to 500Hz before publication, so this will be a second, gentler pass and visible change will be small but explicit</w:t>
+      </w:r>
+    </w:p>
+    <w:p>
+      <w:pPr>
+        <w:rPr>
+          <w:color w:val="000000" w:themeColor="text1"/>
+        </w:rPr>
+      </w:pPr>
+    </w:p>
+    <w:p>
+      <w:pPr>
+        <w:rPr>
+          <w:b/>
+          <w:bCs/>
+          <w:color w:val="000000" w:themeColor="text1"/>
+        </w:rPr>
+      </w:pPr>
+      <w:r>
+        <w:rPr>
+          <w:b/>
+          <w:bCs/>
+          <w:color w:val="000000" w:themeColor="text1"/>
+        </w:rPr>
+        <w:t>Windowing:</w:t>
+      </w:r>
+    </w:p>
+    <w:p>
+      <w:r>
+        <w:t xml:space="preserve">I slide 50 </w:t>
+      </w:r>
+      <w:proofErr w:type="spellStart"/>
+      <w:r>
+        <w:t>ms</w:t>
+      </w:r>
+      <w:proofErr w:type="spellEnd"/>
+      <w:r>
+        <w:t xml:space="preserve"> between windows, which means a new decision 20 times a second. Because the hop is smaller than the window, each window overlaps the next one by 150 </w:t>
+      </w:r>
+      <w:proofErr w:type="spellStart"/>
+      <w:r>
+        <w:t>ms</w:t>
+      </w:r>
+      <w:proofErr w:type="spellEnd"/>
+      <w:r>
+        <w:t xml:space="preserve">, so neighbouring windows contain mostly the same data. Noting that because it feels like it might matter later. </w:t>
+      </w:r>
+    </w:p>
+    <w:p/>
+    <w:p>
+      <w:r>
+        <w:t>I also cut half a second off each end of every trial. The person is still moving into the gesture at the start and relaxing out of it at the end, but the file labels all 5 seconds as the gesture. Those edge bits would just be wrong labels.</w:t>
+      </w:r>
+    </w:p>
+    <w:p>
+      <w:pPr>
+        <w:rPr>
+          <w:b/>
+          <w:bCs/>
+          <w:color w:val="000000" w:themeColor="text1"/>
+        </w:rPr>
+      </w:pPr>
+    </w:p>
+    <w:p>
+      <w:r>
+        <w:rPr>
+          <w:b/>
+          <w:bCs/>
+        </w:rPr>
+        <w:t>Numbers:</w:t>
+      </w:r>
+      <w:r>
+        <w:t xml:space="preserve"> </w:t>
+      </w:r>
+    </w:p>
+    <w:p>
+      <w:r>
+        <w:t xml:space="preserve">5s is 10240 samples, minus 1024 trimmed off each end leaves 8192. A 200 </w:t>
+      </w:r>
+      <w:proofErr w:type="spellStart"/>
+      <w:r>
+        <w:t>ms</w:t>
+      </w:r>
+      <w:proofErr w:type="spellEnd"/>
+      <w:r>
+        <w:t xml:space="preserve"> window is 410 </w:t>
+      </w:r>
+      <w:proofErr w:type="gramStart"/>
+      <w:r>
+        <w:t>samples</w:t>
+      </w:r>
+      <w:proofErr w:type="gramEnd"/>
+      <w:r>
+        <w:t xml:space="preserve"> and a 50 </w:t>
+      </w:r>
+      <w:proofErr w:type="spellStart"/>
+      <w:r>
+        <w:t>ms</w:t>
+      </w:r>
+      <w:proofErr w:type="spellEnd"/>
+      <w:r>
+        <w:t xml:space="preserve"> hop is 102, which gives 77 windows per trial and 9163 windows for participant 1.</w:t>
+      </w:r>
+    </w:p>
+    <w:p/>
+    <w:p>
+      <w:pPr>
+        <w:rPr>
+          <w:b/>
+          <w:bCs/>
+          <w:color w:val="000000" w:themeColor="text1"/>
+        </w:rPr>
+      </w:pPr>
+      <w:r>
+        <w:rPr>
+          <w:b/>
+          <w:bCs/>
+          <w:color w:val="000000" w:themeColor="text1"/>
+        </w:rPr>
+        <w:drawing>
+          <wp:anchor distT="0" distB="0" distL="114300" distR="114300" simplePos="0" relativeHeight="251666432" behindDoc="0" locked="0" layoutInCell="1" allowOverlap="1" wp14:anchorId="6A47484B" wp14:editId="4BAD5A0F">
+            <wp:simplePos x="0" y="0"/>
+            <wp:positionH relativeFrom="column">
+              <wp:posOffset>0</wp:posOffset>
+            </wp:positionH>
+            <wp:positionV relativeFrom="paragraph">
+              <wp:posOffset>0</wp:posOffset>
+            </wp:positionV>
+            <wp:extent cx="5731510" cy="578485"/>
+            <wp:effectExtent l="0" t="0" r="0" b="5715"/>
+            <wp:wrapNone/>
+            <wp:docPr id="571859111" name="Picture 1"/>
+            <wp:cNvGraphicFramePr>
+              <a:graphicFrameLocks xmlns:a="http://schemas.openxmlformats.org/drawingml/2006/main" noChangeAspect="1"/>
+            </wp:cNvGraphicFramePr>
+            <a:graphic xmlns:a="http://schemas.openxmlformats.org/drawingml/2006/main">
+              <a:graphicData uri="http://schemas.openxmlformats.org/drawingml/2006/picture">
+                <pic:pic xmlns:pic="http://schemas.openxmlformats.org/drawingml/2006/picture">
+                  <pic:nvPicPr>
+                    <pic:cNvPr id="571859111" name=""/>
+                    <pic:cNvPicPr/>
+                  </pic:nvPicPr>
+                  <pic:blipFill>
+                    <a:blip r:embed="rId11"/>
+                    <a:stretch>
+                      <a:fillRect/>
+                    </a:stretch>
+                  </pic:blipFill>
+                  <pic:spPr>
+                    <a:xfrm>
+                      <a:off x="0" y="0"/>
+                      <a:ext cx="5731510" cy="578485"/>
+                    </a:xfrm>
+                    <a:prstGeom prst="rect">
+                      <a:avLst/>
+                    </a:prstGeom>
+                  </pic:spPr>
+                </pic:pic>
+              </a:graphicData>
+            </a:graphic>
+          </wp:anchor>
+        </w:drawing>
+      </w:r>
+    </w:p>
+    <w:p>
+      <w:pPr>
+        <w:rPr>
+          <w:color w:val="000000" w:themeColor="text1"/>
+        </w:rPr>
+      </w:pPr>
+    </w:p>
+    <w:p>
+      <w:pPr>
+        <w:rPr>
+          <w:b/>
+          <w:bCs/>
+          <w:color w:val="000000" w:themeColor="text1"/>
+        </w:rPr>
+      </w:pPr>
+      <w:r>
+        <w:rPr>
+          <w:b/>
+          <w:bCs/>
+          <w:color w:val="000000" w:themeColor="text1"/>
+        </w:rPr>
+        <w:t>## get_data.py</w:t>
+      </w:r>
+    </w:p>
+    <w:p>
+      <w:pPr>
+        <w:rPr>
+          <w:b/>
+          <w:bCs/>
+          <w:color w:val="000000" w:themeColor="text1"/>
+        </w:rPr>
+      </w:pPr>
+    </w:p>
+    <w:p>
+      <w:pPr>
+        <w:rPr>
+          <w:b/>
+          <w:bCs/>
+          <w:color w:val="000000" w:themeColor="text1"/>
+        </w:rPr>
+      </w:pPr>
+    </w:p>
+    <w:p>
+      <w:pPr>
+        <w:rPr>
+          <w:b/>
+          <w:bCs/>
+          <w:color w:val="000000" w:themeColor="text1"/>
+        </w:rPr>
+      </w:pPr>
+    </w:p>
+    <w:p>
+      <w:pPr>
+        <w:rPr>
+          <w:color w:val="000000" w:themeColor="text1"/>
+        </w:rPr>
+      </w:pPr>
+      <w:r>
+        <w:rPr>
+          <w:color w:val="000000" w:themeColor="text1"/>
+        </w:rPr>
+        <w:t xml:space="preserve">2026-09-09 – Session </w:t>
+      </w:r>
+      <w:r>
+        <w:rPr>
+          <w:color w:val="000000" w:themeColor="text1"/>
+        </w:rPr>
+        <w:t>4</w:t>
+      </w:r>
+      <w:r>
+        <w:rPr>
+          <w:color w:val="000000" w:themeColor="text1"/>
+        </w:rPr>
+        <w:t xml:space="preserve">: </w:t>
+      </w:r>
+      <w:r>
+        <w:rPr>
+          <w:color w:val="000000" w:themeColor="text1"/>
+        </w:rPr>
+        <w:t>The First Classifier</w:t>
+      </w:r>
+    </w:p>
+    <w:p>
+      <w:pPr>
+        <w:rPr>
+          <w:color w:val="000000" w:themeColor="text1"/>
+        </w:rPr>
+      </w:pPr>
+    </w:p>
+    <w:p>
+      <w:r>
+        <w:t>A classifier is a program that you show examples to, along with the right answer for each, and it works out a rule for telling them apart.</w:t>
+      </w:r>
+    </w:p>
+    <w:p/>
+    <w:p>
+      <w:pPr>
+        <w:rPr>
+          <w:color w:val="000000" w:themeColor="text1"/>
+        </w:rPr>
+      </w:pPr>
+      <w:r>
+        <w:rPr>
+          <w:b/>
+          <w:bCs/>
+          <w:color w:val="000000" w:themeColor="text1"/>
+        </w:rPr>
+        <w:t>Features</w:t>
+      </w:r>
+      <w:r>
+        <w:rPr>
+          <w:color w:val="000000" w:themeColor="text1"/>
+        </w:rPr>
+        <w:t xml:space="preserve">. Right </w:t>
+      </w:r>
+      <w:proofErr w:type="gramStart"/>
+      <w:r>
+        <w:rPr>
+          <w:color w:val="000000" w:themeColor="text1"/>
+        </w:rPr>
+        <w:t>now</w:t>
+      </w:r>
+      <w:proofErr w:type="gramEnd"/>
+      <w:r>
+        <w:rPr>
+          <w:color w:val="000000" w:themeColor="text1"/>
+        </w:rPr>
+        <w:t xml:space="preserve"> one window is 410 by 16, which is 6560 numbers. That is far too much, and most of it is noise. A feature is a summary number that captures something useful. We are going to squash each window down to just 16 numbers, one per electrode.</w:t>
+      </w:r>
+    </w:p>
+    <w:p>
+      <w:pPr>
+        <w:rPr>
+          <w:color w:val="000000" w:themeColor="text1"/>
+        </w:rPr>
+      </w:pPr>
+    </w:p>
+    <w:p>
+      <w:pPr>
+        <w:rPr>
+          <w:color w:val="000000" w:themeColor="text1"/>
+        </w:rPr>
+      </w:pPr>
+      <w:r>
+        <w:rPr>
+          <w:b/>
+          <w:bCs/>
+          <w:color w:val="000000" w:themeColor="text1"/>
+        </w:rPr>
+        <w:lastRenderedPageBreak/>
+        <w:t>Label</w:t>
+      </w:r>
+      <w:r>
+        <w:rPr>
+          <w:color w:val="000000" w:themeColor="text1"/>
+        </w:rPr>
+        <w:t>. The right answer for an example. Here it is just 0 for hand open and 1 for hand close.</w:t>
+      </w:r>
+    </w:p>
+    <w:p>
+      <w:pPr>
+        <w:rPr>
+          <w:color w:val="000000" w:themeColor="text1"/>
+        </w:rPr>
+      </w:pPr>
+    </w:p>
+    <w:p>
+      <w:pPr>
+        <w:rPr>
+          <w:color w:val="000000" w:themeColor="text1"/>
+        </w:rPr>
+      </w:pPr>
+    </w:p>
+    <w:p>
+      <w:pPr>
+        <w:rPr>
+          <w:color w:val="000000" w:themeColor="text1"/>
+        </w:rPr>
+      </w:pPr>
+      <w:r>
+        <w:rPr>
+          <w:color w:val="000000" w:themeColor="text1"/>
+        </w:rPr>
+        <w:t>Two gestures, hand open and hand close. Feature is MAV per channel: rectify</w:t>
+      </w:r>
+      <w:r>
+        <w:rPr>
+          <w:color w:val="000000" w:themeColor="text1"/>
+        </w:rPr>
+        <w:t xml:space="preserve"> </w:t>
+      </w:r>
+      <w:r>
+        <w:rPr>
+          <w:color w:val="000000" w:themeColor="text1"/>
+        </w:rPr>
+        <w:t>the window and average over time, so each 410 x 16 window becomes a 16-number</w:t>
+      </w:r>
+      <w:r>
+        <w:rPr>
+          <w:color w:val="000000" w:themeColor="text1"/>
+        </w:rPr>
+        <w:t xml:space="preserve"> </w:t>
+      </w:r>
+      <w:r>
+        <w:rPr>
+          <w:color w:val="000000" w:themeColor="text1"/>
+        </w:rPr>
+        <w:t>pattern across the electrode ring. Classifier is LDA, which is also what real</w:t>
+      </w:r>
+      <w:r>
+        <w:rPr>
+          <w:color w:val="000000" w:themeColor="text1"/>
+        </w:rPr>
+        <w:t xml:space="preserve"> </w:t>
+      </w:r>
+      <w:r>
+        <w:rPr>
+          <w:color w:val="000000" w:themeColor="text1"/>
+        </w:rPr>
+        <w:t>prosthetic pattern recognition systems use, so it is a genuine baseline.</w:t>
+      </w:r>
+      <w:r>
+        <w:rPr>
+          <w:color w:val="000000" w:themeColor="text1"/>
+        </w:rPr>
+        <w:t xml:space="preserve"> </w:t>
+      </w:r>
+    </w:p>
+    <w:p>
+      <w:pPr>
+        <w:rPr>
+          <w:color w:val="000000" w:themeColor="text1"/>
+        </w:rPr>
+      </w:pPr>
+    </w:p>
+    <w:p>
+      <w:pPr>
+        <w:rPr>
+          <w:color w:val="000000" w:themeColor="text1"/>
+        </w:rPr>
+      </w:pPr>
+      <w:r>
+        <w:rPr>
+          <w:color w:val="000000" w:themeColor="text1"/>
+        </w:rPr>
+        <w:t>1078 windows, 70/30 random split, accuracy 0.99.</w:t>
+      </w:r>
+    </w:p>
+    <w:p>
+      <w:pPr>
+        <w:rPr>
+          <w:color w:val="000000" w:themeColor="text1"/>
+        </w:rPr>
+      </w:pPr>
+    </w:p>
+    <w:p>
+      <w:pPr>
+        <w:rPr>
+          <w:color w:val="000000" w:themeColor="text1"/>
+        </w:rPr>
+      </w:pPr>
+      <w:r>
+        <w:rPr>
+          <w:color w:val="000000" w:themeColor="text1"/>
+        </w:rPr>
+        <w:t>That contradicts session 2. There I measured hand close at only about 1.2x</w:t>
+      </w:r>
+      <w:r>
+        <w:rPr>
+          <w:color w:val="000000" w:themeColor="text1"/>
+        </w:rPr>
+        <w:t xml:space="preserve"> </w:t>
+      </w:r>
+      <w:r>
+        <w:rPr>
+          <w:color w:val="000000" w:themeColor="text1"/>
+        </w:rPr>
+        <w:t>hand open on one channel, with the variation between the seven repetitions of</w:t>
+      </w:r>
+      <w:r>
+        <w:rPr>
+          <w:color w:val="000000" w:themeColor="text1"/>
+        </w:rPr>
+        <w:t xml:space="preserve"> </w:t>
+      </w:r>
+      <w:r>
+        <w:rPr>
+          <w:color w:val="000000" w:themeColor="text1"/>
+        </w:rPr>
+        <w:t>a gesture about as large as the gap between different gestures. A single</w:t>
+      </w:r>
+      <w:r>
+        <w:rPr>
+          <w:color w:val="000000" w:themeColor="text1"/>
+        </w:rPr>
+        <w:t xml:space="preserve"> </w:t>
+      </w:r>
+      <w:r>
+        <w:rPr>
+          <w:color w:val="000000" w:themeColor="text1"/>
+        </w:rPr>
+        <w:t>amplitude feature should not separate those at 99%. Something in the setup is</w:t>
+      </w:r>
+      <w:r>
+        <w:rPr>
+          <w:color w:val="000000" w:themeColor="text1"/>
+        </w:rPr>
+        <w:t xml:space="preserve"> </w:t>
+      </w:r>
+      <w:r>
+        <w:rPr>
+          <w:color w:val="000000" w:themeColor="text1"/>
+        </w:rPr>
+        <w:t>doing work it should not be. Looking into it before building anything on top.</w:t>
+      </w:r>
+    </w:p>
+    <w:p>
+      <w:pPr>
+        <w:rPr>
+          <w:b/>
+          <w:bCs/>
+          <w:color w:val="000000" w:themeColor="text1"/>
+        </w:rPr>
+      </w:pPr>
+    </w:p>
+    <w:p>
+      <w:pPr>
+        <w:rPr>
+          <w:b/>
+          <w:bCs/>
+          <w:color w:val="000000" w:themeColor="text1"/>
           <w:u w:val="single"/>
         </w:rPr>
       </w:pPr>
     </w:p>
     <w:sdt>
       <w:sdtPr>
+        <w:rPr>
+          <w:color w:val="000000" w:themeColor="text1"/>
+        </w:rPr>
         <w:id w:val="-1508518993"/>
         <w:docPartObj>
           <w:docPartGallery w:val="Bibliographies"/>
@@ -172,7 +1688,6 @@
       <w:sdtEndPr>
         <w:rPr>
           <w:rFonts w:asciiTheme="minorHAnsi" w:eastAsiaTheme="minorHAnsi" w:hAnsiTheme="minorHAnsi" w:cstheme="minorBidi"/>
-          <w:color w:val="auto"/>
           <w:sz w:val="24"/>
           <w:szCs w:val="24"/>
         </w:rPr>
@@ -181,25 +1696,48 @@
         <w:p>
           <w:pPr>
             <w:pStyle w:val="Heading1"/>
+            <w:rPr>
+              <w:color w:val="000000" w:themeColor="text1"/>
+            </w:rPr>
           </w:pPr>
           <w:r>
+            <w:rPr>
+              <w:color w:val="000000" w:themeColor="text1"/>
+            </w:rPr>
             <w:t>Bibliography</w:t>
           </w:r>
         </w:p>
         <w:sdt>
           <w:sdtPr>
+            <w:rPr>
+              <w:color w:val="000000" w:themeColor="text1"/>
+            </w:rPr>
             <w:id w:val="111145805"/>
             <w:bibliography/>
           </w:sdtPr>
           <w:sdtContent>
             <w:p>
+              <w:pPr>
+                <w:rPr>
+                  <w:color w:val="000000" w:themeColor="text1"/>
+                </w:rPr>
+              </w:pPr>
               <w:r>
+                <w:rPr>
+                  <w:color w:val="000000" w:themeColor="text1"/>
+                </w:rPr>
                 <w:fldChar w:fldCharType="begin"/>
               </w:r>
               <w:r>
+                <w:rPr>
+                  <w:color w:val="000000" w:themeColor="text1"/>
+                </w:rPr>
                 <w:instrText xml:space="preserve"> BIBLIOGRAPHY </w:instrText>
               </w:r>
               <w:r>
+                <w:rPr>
+                  <w:color w:val="000000" w:themeColor="text1"/>
+                </w:rPr>
                 <w:fldChar w:fldCharType="separate"/>
               </w:r>
               <w:r>
@@ -207,6 +1745,7 @@
                   <w:b/>
                   <w:bCs/>
                   <w:noProof/>
+                  <w:color w:val="000000" w:themeColor="text1"/>
                 </w:rPr>
                 <w:t>Invalid source specified.</w:t>
               </w:r>
@@ -215,6 +1754,7 @@
                   <w:b/>
                   <w:bCs/>
                   <w:noProof/>
+                  <w:color w:val="000000" w:themeColor="text1"/>
                 </w:rPr>
                 <w:fldChar w:fldCharType="end"/>
               </w:r>
@@ -228,6 +1768,7 @@
         <w:rPr>
           <w:b/>
           <w:bCs/>
+          <w:color w:val="000000" w:themeColor="text1"/>
           <w:u w:val="single"/>
         </w:rPr>
       </w:pPr>
@@ -278,6 +1819,219 @@
     </w:p>
   </w:footnote>
 </w:footnotes>
+</file>
+
+<file path=word/numbering.xml><?xml version="1.0" encoding="utf-8"?>
+<w:numbering xmlns:wpc="http://schemas.microsoft.com/office/word/2010/wordprocessingCanvas" xmlns:cx="http://schemas.microsoft.com/office/drawing/2014/chartex" xmlns:cx1="http://schemas.microsoft.com/office/drawing/2015/9/8/chartex" xmlns:cx2="http://schemas.microsoft.com/office/drawing/2015/10/21/chartex" xmlns:cx3="http://schemas.microsoft.com/office/drawing/2016/5/9/chartex" xmlns:cx4="http://schemas.microsoft.com/office/drawing/2016/5/10/chartex" xmlns:cx5="http://schemas.microsoft.com/office/drawing/2016/5/11/chartex" xmlns:cx6="http://schemas.microsoft.com/office/drawing/2016/5/12/chartex" xmlns:cx7="http://schemas.microsoft.com/office/drawing/2016/5/13/chartex" xmlns:cx8="http://schemas.microsoft.com/office/drawing/2016/5/14/chartex" xmlns:mc="http://schemas.openxmlformats.org/markup-compatibility/2006" xmlns:m="http://schemas.openxmlformats.org/officeDocument/2006/math" xmlns:aink="http://schemas.microsoft.com/office/drawing/2016/ink" xmlns:am3d="http://schemas.microsoft.com/office/drawing/2017/model3d" xmlns:oel="http://schemas.microsoft.com/office/2019/extlst" xmlns:r="http://schemas.openxmlformats.org/officeDocument/2006/relationships" xmlns:wp14="http://schemas.microsoft.com/office/word/2010/wordprocessingDrawing" xmlns:wp="http://schemas.openxmlformats.org/drawingml/2006/wordprocessingDrawing" xmlns:wpg="http://schemas.microsoft.com/office/word/2010/wordprocessingGroup" xmlns:wpi="http://schemas.microsoft.com/office/word/2010/wordprocessingInk" xmlns:wps="http://schemas.microsoft.com/office/word/2010/wordprocessingShape" xmlns:o="urn:schemas-microsoft-com:office:office" xmlns:v="urn:schemas-microsoft-com:vml" xmlns:w10="urn:schemas-microsoft-com:office:word" xmlns:w="http://schemas.openxmlformats.org/wordprocessingml/2006/main" xmlns:w14="http://schemas.microsoft.com/office/word/2010/wordml" xmlns:w15="http://schemas.microsoft.com/office/word/2012/wordml" xmlns:w16cex="http://schemas.microsoft.com/office/word/2018/wordml/cex" xmlns:w16cid="http://schemas.microsoft.com/office/word/2016/wordml/cid" xmlns:w16="http://schemas.microsoft.com/office/word/2018/wordml" xmlns:w16sdtdh="http://schemas.microsoft.com/office/word/2020/wordml/sdtdatahash" xmlns:w16sdtfl="http://schemas.microsoft.com/office/word/2024/wordml/sdtformatlock" xmlns:w16se="http://schemas.microsoft.com/office/word/2015/wordml/symex" xmlns:w16du="http://schemas.microsoft.com/office/word/2023/wordml/word16du" xmlns:wne="http://schemas.microsoft.com/office/word/2006/wordml" mc:Ignorable="w14 w15 w16se w16cid w16 w16cex w16sdtdh w16sdtfl w16du wp14">
+  <w:abstractNum w:abstractNumId="0" w15:restartNumberingAfterBreak="0">
+    <w:nsid w:val="47247B2B"/>
+    <w:multiLevelType w:val="hybridMultilevel"/>
+    <w:tmpl w:val="117630D6"/>
+    <w:lvl w:ilvl="0" w:tplc="3364D056">
+      <w:start w:val="2026"/>
+      <w:numFmt w:val="bullet"/>
+      <w:lvlText w:val="-"/>
+      <w:lvlJc w:val="left"/>
+      <w:pPr>
+        <w:ind w:left="720" w:hanging="360"/>
+      </w:pPr>
+      <w:rPr>
+        <w:rFonts w:ascii="Aptos" w:eastAsiaTheme="minorHAnsi" w:hAnsi="Aptos" w:cstheme="minorBidi" w:hint="default"/>
+      </w:rPr>
+    </w:lvl>
+    <w:lvl w:ilvl="1" w:tplc="08090003" w:tentative="1">
+      <w:start w:val="1"/>
+      <w:numFmt w:val="bullet"/>
+      <w:lvlText w:val="o"/>
+      <w:lvlJc w:val="left"/>
+      <w:pPr>
+        <w:ind w:left="1440" w:hanging="360"/>
+      </w:pPr>
+      <w:rPr>
+        <w:rFonts w:ascii="Courier New" w:hAnsi="Courier New" w:cs="Courier New" w:hint="default"/>
+      </w:rPr>
+    </w:lvl>
+    <w:lvl w:ilvl="2" w:tplc="08090005" w:tentative="1">
+      <w:start w:val="1"/>
+      <w:numFmt w:val="bullet"/>
+      <w:lvlText w:val=""/>
+      <w:lvlJc w:val="left"/>
+      <w:pPr>
+        <w:ind w:left="2160" w:hanging="360"/>
+      </w:pPr>
+      <w:rPr>
+        <w:rFonts w:ascii="Wingdings" w:hAnsi="Wingdings" w:hint="default"/>
+      </w:rPr>
+    </w:lvl>
+    <w:lvl w:ilvl="3" w:tplc="08090001" w:tentative="1">
+      <w:start w:val="1"/>
+      <w:numFmt w:val="bullet"/>
+      <w:lvlText w:val=""/>
+      <w:lvlJc w:val="left"/>
+      <w:pPr>
+        <w:ind w:left="2880" w:hanging="360"/>
+      </w:pPr>
+      <w:rPr>
+        <w:rFonts w:ascii="Symbol" w:hAnsi="Symbol" w:hint="default"/>
+      </w:rPr>
+    </w:lvl>
+    <w:lvl w:ilvl="4" w:tplc="08090003" w:tentative="1">
+      <w:start w:val="1"/>
+      <w:numFmt w:val="bullet"/>
+      <w:lvlText w:val="o"/>
+      <w:lvlJc w:val="left"/>
+      <w:pPr>
+        <w:ind w:left="3600" w:hanging="360"/>
+      </w:pPr>
+      <w:rPr>
+        <w:rFonts w:ascii="Courier New" w:hAnsi="Courier New" w:cs="Courier New" w:hint="default"/>
+      </w:rPr>
+    </w:lvl>
+    <w:lvl w:ilvl="5" w:tplc="08090005" w:tentative="1">
+      <w:start w:val="1"/>
+      <w:numFmt w:val="bullet"/>
+      <w:lvlText w:val=""/>
+      <w:lvlJc w:val="left"/>
+      <w:pPr>
+        <w:ind w:left="4320" w:hanging="360"/>
+      </w:pPr>
+      <w:rPr>
+        <w:rFonts w:ascii="Wingdings" w:hAnsi="Wingdings" w:hint="default"/>
+      </w:rPr>
+    </w:lvl>
+    <w:lvl w:ilvl="6" w:tplc="08090001" w:tentative="1">
+      <w:start w:val="1"/>
+      <w:numFmt w:val="bullet"/>
+      <w:lvlText w:val=""/>
+      <w:lvlJc w:val="left"/>
+      <w:pPr>
+        <w:ind w:left="5040" w:hanging="360"/>
+      </w:pPr>
+      <w:rPr>
+        <w:rFonts w:ascii="Symbol" w:hAnsi="Symbol" w:hint="default"/>
+      </w:rPr>
+    </w:lvl>
+    <w:lvl w:ilvl="7" w:tplc="08090003" w:tentative="1">
+      <w:start w:val="1"/>
+      <w:numFmt w:val="bullet"/>
+      <w:lvlText w:val="o"/>
+      <w:lvlJc w:val="left"/>
+      <w:pPr>
+        <w:ind w:left="5760" w:hanging="360"/>
+      </w:pPr>
+      <w:rPr>
+        <w:rFonts w:ascii="Courier New" w:hAnsi="Courier New" w:cs="Courier New" w:hint="default"/>
+      </w:rPr>
+    </w:lvl>
+    <w:lvl w:ilvl="8" w:tplc="08090005" w:tentative="1">
+      <w:start w:val="1"/>
+      <w:numFmt w:val="bullet"/>
+      <w:lvlText w:val=""/>
+      <w:lvlJc w:val="left"/>
+      <w:pPr>
+        <w:ind w:left="6480" w:hanging="360"/>
+      </w:pPr>
+      <w:rPr>
+        <w:rFonts w:ascii="Wingdings" w:hAnsi="Wingdings" w:hint="default"/>
+      </w:rPr>
+    </w:lvl>
+  </w:abstractNum>
+  <w:abstractNum w:abstractNumId="1" w15:restartNumberingAfterBreak="0">
+    <w:nsid w:val="64835351"/>
+    <w:multiLevelType w:val="hybridMultilevel"/>
+    <w:tmpl w:val="EBAE3BA4"/>
+    <w:lvl w:ilvl="0" w:tplc="B44AFBFE">
+      <w:start w:val="1"/>
+      <w:numFmt w:val="decimal"/>
+      <w:lvlText w:val="%1."/>
+      <w:lvlJc w:val="left"/>
+      <w:pPr>
+        <w:ind w:left="1080" w:hanging="360"/>
+      </w:pPr>
+      <w:rPr>
+        <w:rFonts w:hint="default"/>
+      </w:rPr>
+    </w:lvl>
+    <w:lvl w:ilvl="1" w:tplc="08090019" w:tentative="1">
+      <w:start w:val="1"/>
+      <w:numFmt w:val="lowerLetter"/>
+      <w:lvlText w:val="%2."/>
+      <w:lvlJc w:val="left"/>
+      <w:pPr>
+        <w:ind w:left="1800" w:hanging="360"/>
+      </w:pPr>
+    </w:lvl>
+    <w:lvl w:ilvl="2" w:tplc="0809001B" w:tentative="1">
+      <w:start w:val="1"/>
+      <w:numFmt w:val="lowerRoman"/>
+      <w:lvlText w:val="%3."/>
+      <w:lvlJc w:val="right"/>
+      <w:pPr>
+        <w:ind w:left="2520" w:hanging="180"/>
+      </w:pPr>
+    </w:lvl>
+    <w:lvl w:ilvl="3" w:tplc="0809000F" w:tentative="1">
+      <w:start w:val="1"/>
+      <w:numFmt w:val="decimal"/>
+      <w:lvlText w:val="%4."/>
+      <w:lvlJc w:val="left"/>
+      <w:pPr>
+        <w:ind w:left="3240" w:hanging="360"/>
+      </w:pPr>
+    </w:lvl>
+    <w:lvl w:ilvl="4" w:tplc="08090019" w:tentative="1">
+      <w:start w:val="1"/>
+      <w:numFmt w:val="lowerLetter"/>
+      <w:lvlText w:val="%5."/>
+      <w:lvlJc w:val="left"/>
+      <w:pPr>
+        <w:ind w:left="3960" w:hanging="360"/>
+      </w:pPr>
+    </w:lvl>
+    <w:lvl w:ilvl="5" w:tplc="0809001B" w:tentative="1">
+      <w:start w:val="1"/>
+      <w:numFmt w:val="lowerRoman"/>
+      <w:lvlText w:val="%6."/>
+      <w:lvlJc w:val="right"/>
+      <w:pPr>
+        <w:ind w:left="4680" w:hanging="180"/>
+      </w:pPr>
+    </w:lvl>
+    <w:lvl w:ilvl="6" w:tplc="0809000F" w:tentative="1">
+      <w:start w:val="1"/>
+      <w:numFmt w:val="decimal"/>
+      <w:lvlText w:val="%7."/>
+      <w:lvlJc w:val="left"/>
+      <w:pPr>
+        <w:ind w:left="5400" w:hanging="360"/>
+      </w:pPr>
+    </w:lvl>
+    <w:lvl w:ilvl="7" w:tplc="08090019" w:tentative="1">
+      <w:start w:val="1"/>
+      <w:numFmt w:val="lowerLetter"/>
+      <w:lvlText w:val="%8."/>
+      <w:lvlJc w:val="left"/>
+      <w:pPr>
+        <w:ind w:left="6120" w:hanging="360"/>
+      </w:pPr>
+    </w:lvl>
+    <w:lvl w:ilvl="8" w:tplc="0809001B" w:tentative="1">
+      <w:start w:val="1"/>
+      <w:numFmt w:val="lowerRoman"/>
+      <w:lvlText w:val="%9."/>
+      <w:lvlJc w:val="right"/>
+      <w:pPr>
+        <w:ind w:left="6840" w:hanging="180"/>
+      </w:pPr>
+    </w:lvl>
+  </w:abstractNum>
+  <w:num w:numId="1" w16cid:durableId="676230977">
+    <w:abstractNumId w:val="1"/>
+  </w:num>
+  <w:num w:numId="2" w16cid:durableId="1607537021">
+    <w:abstractNumId w:val="0"/>
+  </w:num>
+</w:numbering>
 </file>
 
 <file path=word/styles.xml><?xml version="1.0" encoding="utf-8"?>
@@ -1272,6 +3026,37 @@
       <w:vertAlign w:val="superscript"/>
     </w:rPr>
   </w:style>
+  <w:style w:type="character" w:styleId="PlaceholderText">
+    <w:name w:val="Placeholder Text"/>
+    <w:basedOn w:val="DefaultParagraphFont"/>
+    <w:uiPriority w:val="99"/>
+    <w:semiHidden/>
+    <w:rsid w:val="00FA6000"/>
+    <w:rPr>
+      <w:color w:val="666666"/>
+    </w:rPr>
+  </w:style>
+  <w:style w:type="paragraph" w:styleId="Footer">
+    <w:name w:val="footer"/>
+    <w:basedOn w:val="Normal"/>
+    <w:link w:val="FooterChar"/>
+    <w:uiPriority w:val="99"/>
+    <w:unhideWhenUsed/>
+    <w:rsid w:val="00FA6000"/>
+    <w:pPr>
+      <w:tabs>
+        <w:tab w:val="center" w:pos="4513"/>
+        <w:tab w:val="right" w:pos="9026"/>
+      </w:tabs>
+    </w:pPr>
+  </w:style>
+  <w:style w:type="character" w:customStyle="1" w:styleId="FooterChar">
+    <w:name w:val="Footer Char"/>
+    <w:basedOn w:val="DefaultParagraphFont"/>
+    <w:link w:val="Footer"/>
+    <w:uiPriority w:val="99"/>
+    <w:rsid w:val="00FA6000"/>
+  </w:style>
 </w:styles>
 </file>
 
@@ -1575,7 +3360,7 @@
 </file>
 
 <file path=customXml/itemProps1.xml><?xml version="1.0" encoding="utf-8"?>
-<ds:datastoreItem xmlns:ds="http://schemas.openxmlformats.org/officeDocument/2006/customXml" ds:itemID="{B1FF8813-A4A5-4A41-A441-35FA83FC40E1}">
+<ds:datastoreItem xmlns:ds="http://schemas.openxmlformats.org/officeDocument/2006/customXml" ds:itemID="{874147AB-6ADD-8E4B-9EA4-D260973A8B9E}">
   <ds:schemaRefs>
     <ds:schemaRef ds:uri="http://schemas.openxmlformats.org/officeDocument/2006/bibliography"/>
   </ds:schemaRefs>

</xml_diff>